<commit_message>
barlow/finesst: proofread pass + cross-doc consistency sweep
Typo fix, citation resequence (Fountain 2014 now [3]), Objective N
capitalization, O3 self-reference removed, Fig 2 caption de-duplicated.
Mentoring plan: 'honest-assessment section' -> 'Assessment section'.
Project summary: retired program names -> spheres, H1/H2 synced to
substrate/ground-ice framing.

Co-Authored-By: Claude Fable 5 <noreply@anthropic.com>
</commit_message>
<xml_diff>
--- a/barlow/finesst_final/proposal_STM.docx
+++ b/barlow/finesst_final/proposal_STM.docx
@@ -42,7 +42,7 @@
         </w:rPr>
       </w:pPr>
       <w:r>
-        <w:t xml:space="preserve">The McMurdo Dry Valleys (MDVs) are the largest ice-free region of Antarctica. They were long treated as one of Earth's most stable landscapes. That view is now an open question. The valleys are energy-limited: ice is everywhere, and there is barely enough summer heat to melt much of it [2]. A small warming produces a measurable response — ephemeral streams (channels that flow only during a brief melt season) carry more water, move sediment, and reshape the terrain. Their pace of change is an early, direct measure of the ice-free Antarctic crossing a climate threshold [10].</w:t>
+        <w:t xml:space="preserve">The McMurdo Dry Valleys (MDVs) are the largest ice-free region of Antarctica. They were long treated as one of Earth's most stable landscapes. That view is now an open question. The valleys are energy-limited: ice is everywhere, and there is barely enough summer heat to melt much of it [2]. A small warming produces a measurable response — ephemeral streams (channels that flow only during a brief melt season) carry more water, move sediment, and reshape the terrain. Their pace of change is an early, direct measure of the ice-free Antarctic crossing a climate threshold [3].</w:t>
       </w:r>
     </w:p>
     <w:p>
@@ -158,7 +158,7 @@
       </w:r>
       <w:proofErr w:type="spellStart"/>
       <w:r>
-        <w:t>contribitutions</w:t>
+        <w:t xml:space="preserve">contributions</w:t>
       </w:r>
       <w:proofErr w:type="spellEnd"/>
       <w:r>
@@ -177,7 +177,7 @@
         </w:rPr>
       </w:pPr>
       <w:r>
-        <w:t xml:space="preserve">A U-Net ML methodology [3], [4] that automatically identifies stream channels using high-resolution terrain (elevation, slope, aspect). </w:t>
+        <w:t xml:space="preserve">A U-Net ML methodology [4], [5] that automatically identifies stream channels using high-resolution terrain (elevation, slope, aspect). </w:t>
       </w:r>
     </w:p>
     <w:p>
@@ -192,7 +192,7 @@
         </w:rPr>
       </w:pPr>
       <w:r>
-        <w:t xml:space="preserve">Initial verification that repeat-acquisition airborne lidar and valley-wide REMA (Reference Elevation Model of Antarctica) satellite DEMs [5] are precise and high-resolution enough to detect stream-corridor changes once aligned to a common geodetic datum and independent external ground control.</w:t>
+        <w:t xml:space="preserve">Initial verification that repeat-acquisition airborne lidar and valley-wide REMA (Reference Elevation Model of Antarctica) satellite DEMs [6] are precise and high-resolution enough to detect stream-corridor changes once aligned to a common geodetic datum and independent external ground control.</w:t>
       </w:r>
     </w:p>
     <w:p>
@@ -257,7 +257,7 @@
         </w:rPr>
       </w:pPr>
       <w:r>
-        <w:t xml:space="preserve">The project directly relates to NASA’s Earth Science Division. It spans three of the Division’s research spheres. The Cryosphere covers the glaciers and their meltwater, the Hydrosphere the stream network, and the Geosphere the changing surface topography. The 2001 baseline is NASA data — airborne lidar swath mapping never fully exploited for surface change [6]. The project turns the airborne lidar, REMA satellite DEMs (corrected and controlled by airborne lidar and ICESat-2 observations) and reanalysis into a temporal, uncertainty-calibrated record of climate-driven surface change in the Dry Valleys. The methodology is applicable beyond the McMurdo Dry Valleys to any elevation-differencing problem, including the surface-change records NASA missions such as ICESat-2 and NISAR produce. NISAR's left-looking, 12-day L-band coverage includes the Dry Valleys [7]. It cannot supply DEMs but can flag melt-season bank disturbance as an independent check. The Dry Valleys are also the canonical terrestrial analog for cold-desert planetary surfaces such as Mars. The proposed research also develops the skills NASA's open-science strategy calls for: open geospatial data, machine learning on remote sensing, and rigorous uncertainty.</w:t>
+        <w:t xml:space="preserve">The project directly relates to NASA’s Earth Science Division. It spans three of the Division’s research spheres. The Cryosphere covers the glaciers and their meltwater, the Hydrosphere the stream network, and the Geosphere the changing surface topography. The 2001 baseline is NASA data — airborne lidar swath mapping never fully exploited for surface change [7]. The project turns the airborne lidar, REMA satellite DEMs (corrected and controlled by airborne lidar and ICESat-2 observations) and reanalysis into a temporal, uncertainty-calibrated record of climate-driven surface change in the Dry Valleys. The methodology is applicable beyond the McMurdo Dry Valleys to any elevation-differencing problem, including the surface-change records NASA missions such as ICESat-2 and NISAR produce. NISAR's left-looking, 12-day L-band coverage includes the Dry Valleys [8]. It cannot supply DEMs but can flag melt-season bank disturbance as an independent check. The Dry Valleys are also the canonical terrestrial analog for cold-desert planetary surfaces such as Mars. The proposed research also develops the skills NASA's open-science strategy calls for: open geospatial data, machine learning on remote sensing, and rigorous uncertainty.</w:t>
       </w:r>
     </w:p>
     <w:p>
@@ -289,7 +289,7 @@
         </w:numPr>
       </w:pPr>
       <w:r>
-        <w:t xml:space="preserve">Attribution (Objective 1). Determination of the climate and landscape drivers that control each stream's rate of geomorphic change. Candidate controls fall into two groups. Climate forcing includes air temperature, incoming sunlight, meltwater discharge, glacial mass balance, and summer thaw. These records come from the McMurdo Dry Valleys Long Term Ecological Research (LTER) network [8]. Coverage gaps are filled with the European Centre for Medium-Range Weather Forecasts ERA5 reanalysis [9] and the Antarctic Mesoscale Prediction System (AMPS). Substrate susceptibility includes microclimate zone, mapped permafrost and ground-ice class, and bed material, drawn from published MDV mapping [10], [11]. We hypothesize that melt energy will predict channel change better than water volume alone after controlling for substrate (H1). Forcing should matter most where ground ice is present. The hypothesis fails if discharge alone predicts channel migration as well as melt energy does, or if substrate class alone absorbs the explanatory power.</w:t>
+        <w:t xml:space="preserve">Attribution (Objective 1). Determination of the climate and landscape drivers that control each stream's rate of geomorphic change. Candidate controls fall into two groups. Climate forcing includes air temperature, incoming sunlight, meltwater discharge, glacial mass balance, and summer thaw. These records come from the McMurdo Dry Valleys Long Term Ecological Research (LTER) network [9]. Coverage gaps are filled with the European Centre for Medium-Range Weather Forecasts ERA5 reanalysis [10] and the Antarctic Mesoscale Prediction System (AMPS). Substrate susceptibility includes microclimate zone, mapped permafrost and ground-ice class, and bed material, drawn from published MDV mapping [3], [11]. We hypothesize that melt energy will predict channel change better than water volume alone after controlling for substrate (H1). Forcing should matter most where ground ice is present. The hypothesis fails if discharge alone predicts channel migration as well as melt energy does, or if substrate class alone absorbs the explanatory power.</w:t>
       </w:r>
     </w:p>
     <w:p>
@@ -336,7 +336,7 @@
         <w:ind w:left="720"/>
       </w:pPr>
       <w:r>
-        <w:t xml:space="preserve">REMA, the only elevation observations past 2014, is built from optical stereo imagery. Its offset from lidar shifts with slope, aspect, and seasonal snow. The terrain-aware uncertainty model in objective 3 absorbs those offsets as part of the method.</w:t>
+        <w:t xml:space="preserve">REMA, the only elevation observations past 2014, is built from optical stereo imagery. Its offset from lidar shifts with slope, aspect, and seasonal snow. The terrain-aware uncertainty model absorbs those offsets as part of the method.</w:t>
       </w:r>
     </w:p>
     <w:p>
@@ -412,7 +412,7 @@
           <w:i/>
           <w:color w:val="404040"/>
         </w:rPr>
-        <w:t>Figure 2. Planned detection-to-attribution workflow: three DEM epochs, co-registration to airborne-lidar and ICESat-2 control, DEM-of-Difference, per-pixel detection floor, then the Objective 1 (channel), Objective 2 (stream-corridor), and Objective 3 (uncertainty) objectives. Method schematic; no results shown.</w:t>
+        <w:t xml:space="preserve">Figure 2. Planned detection-to-attribution workflow: three DEM epochs, co-registration to airborne-lidar and ICESat-2 control, DEM-of-Difference, per-pixel detection floor, then the Objective 1 (channel), Objective 2 (stream-corridor), and Objective 3 (uncertainty) analyses. Method schematic; no results shown.</w:t>
       </w:r>
     </w:p>
     <w:p>
@@ -432,7 +432,7 @@
         </w:numPr>
       </w:pPr>
       <w:r>
-        <w:t xml:space="preserve">Objective 1 tests whether melt energy predicts channel change better than water volume alone. To test it, each gauged stream's change rate is measured: co-register the two elevation epochs (removing the median vertical offset over stable ground, with an optional iterative closest point (ICP) refinement), resample to a shared grid, difference them, keep only pixels whose change clears the detection floor (the per-pixel level of detection at 95% confidence, LOD95, from objective 3), and integrate that change inside the channel outline, normalized by channel area and years elapsed to a rate in cm/yr.</w:t>
+        <w:t xml:space="preserve">Objective 1 tests whether melt energy predicts channel change better than water volume alone. To test it, each gauged stream's change rate is measured: co-register the two elevation epochs (removing the median vertical offset over stable ground, with an optional iterative closest point (ICP) refinement), resample to a shared grid, difference them, keep only pixels whose change clears the detection floor (the per-pixel level of detection at 95% confidence, LOD95, from Objective 3), and integrate that change inside the channel outline, normalized by channel area and years elapsed to a rate in cm/yr.</w:t>
       </w:r>
     </w:p>
     <w:p>
@@ -492,7 +492,7 @@
         </w:numPr>
       </w:pPr>
       <w:r>
-        <w:t xml:space="preserve">Apply the objective-3 per-pixel thresholds along the stream corridor and pull out each change patch as a connected group of super-threshold pixels, dropping patches below a minimum mapping unit to suppress isolated-pixel noise. Bedrock and stable soils flanking the corridor supply the fixed reference used to co-register the sensors (using ICESat-2 and 2014 NCALM lidar), so change is measured against genuinely stable ground. Stable ground is defined as any area the channel detector marks as non-stream in every epoch, and that computed surface is the reference.</w:t>
+        <w:t xml:space="preserve">Apply the Objective 3 per-pixel thresholds along the stream corridor and pull out each change patch as a connected group of super-threshold pixels, dropping patches below a minimum mapping unit to suppress isolated-pixel noise. Bedrock and stable soils flanking the corridor supply the fixed reference used to co-register the sensors (using ICESat-2 and 2014 NCALM lidar), so change is measured against genuinely stable ground. Stable ground is defined as any area the channel detector marks as non-stream in every epoch, and that computed surface is the reference.</w:t>
       </w:r>
     </w:p>
     <w:p>
@@ -516,7 +516,7 @@
         </w:numPr>
       </w:pPr>
       <w:r>
-        <w:t xml:space="preserve">Run each process type’s rates through the objective 1 driver models and compare.</w:t>
+        <w:t xml:space="preserve">Run each process type’s rates through the Objective 1 driver models and compare.</w:t>
       </w:r>
     </w:p>
     <w:p>
@@ -548,7 +548,7 @@
         </w:numPr>
       </w:pPr>
       <w:r>
-        <w:t xml:space="preserve">Model the noise as a function of slope, aspect, and sensor pair instead of a single valley-wide value, as previously used, to adaptively estimate level of change significance. Bin the stable-ground differences on those variables, take the normalized median absolute deviation (NMAD) in each bin, and fit a smooth surface through the bins so every pixel carries its own LOD95 (= 1.96 x NMAD) threshold.</w:t>
+        <w:t xml:space="preserve">Model the noise as a function of slope, aspect, and sensor pair instead of a single valley-wide value, as previously used, to adaptively estimate the level of change significance. Bin the stable-ground differences on those variables, take the normalized median absolute deviation (NMAD) in each bin, and fit a smooth surface through the bins so every pixel carries its own LOD95 (= 1.96 x NMAD) threshold.</w:t>
       </w:r>
     </w:p>
     <w:p>
@@ -560,7 +560,7 @@
         </w:numPr>
       </w:pPr>
       <w:r>
-        <w:t xml:space="preserve">Publish a map of per-pixel threshold map and verify the 5%-on-stable-ground property. There is also a check that assumes nothing about stable ground. Difference a 2014 REMA DEM against the 2014 lidar DEM. Both map the same year, so the true change should be zero. Whatever is left over is sensor error, and that is what can be used to calibrate the noise model.</w:t>
+        <w:t xml:space="preserve">Publish the per-pixel threshold map and verify the 5%-on-stable-ground property. There is also a check that assumes nothing about stable ground. Difference a 2014 REMA DEM against the 2014 lidar DEM. Both map the same year, so the true change should be zero. Whatever is left over is sensor error, and that is what can be used to calibrate the noise model.</w:t>
       </w:r>
     </w:p>
     <w:p>
@@ -1381,7 +1381,7 @@
                 <w:sz w:val="18"/>
                 <w:szCs w:val="18"/>
               </w:rPr>
-              <w:t>published MDV mapping [10], [11]</w:t>
+              <w:t>published MDV mapping [3], [11]</w:t>
             </w:r>
           </w:p>
         </w:tc>
@@ -1495,7 +1495,7 @@
     </w:p>
     <w:p>
       <w:r>
-        <w:t xml:space="preserve">Gauge records are patchy after 2015. Stream gauging in the MDVs declined, and some streams have only a few dozen recorded days in the satellite epoch. The sunlight-to-discharge regression in objective 1 mitigates this risk, though the discharge side of the hypothesis stays weakest in the most recent period.</w:t>
+        <w:t xml:space="preserve">Gauge records are patchy after 2015. Stream gauging in the MDVs declined, and some streams have only a few dozen recorded days in the satellite epoch. The sunlight-to-discharge regression in Objective 1 mitigates this risk, though the discharge side of the hypothesis stays weakest in the most recent period.</w:t>
       </w:r>
     </w:p>
     <w:p>
@@ -1526,7 +1526,7 @@
     </w:p>
     <w:p>
       <w:r>
-        <w:t xml:space="preserve">Outside the channels, much of the slowly changing valley floor may sit below our detection threshold. If so, objective 2 stays tight to the channel and its immediate margins, and results are reported at that scope.</w:t>
+        <w:t xml:space="preserve">Outside the channels, much of the slowly changing valley floor may sit below our detection threshold. If so, Objective 2 stays tight to the channel and its immediate margins, and results are reported at that scope.</w:t>
       </w:r>
     </w:p>
     <w:p>
@@ -1634,7 +1634,7 @@
                 <w:rFonts w:ascii="Times New Roman" w:hAnsi="Times New Roman"/>
                 <w:sz w:val="18"/>
               </w:rPr>
-              <w:t>Stage  1</w:t>
+              <w:t xml:space="preserve">Stage 1</w:t>
             </w:r>
           </w:p>
         </w:tc>
@@ -1883,13 +1883,48 @@
         <w:rPr>
           <w:rFonts w:ascii="Times New Roman" w:hAnsi="Times New Roman"/>
         </w:rPr>
-        <w:t xml:space="preserve">[3] </w:t>
+        <w:t xml:space="preserve">[3] Fountain, A. G., Levy, J. S., </w:t>
       </w:r>
       <w:proofErr w:type="spellStart"/>
       <w:r>
         <w:rPr>
           <w:rFonts w:ascii="Times New Roman" w:hAnsi="Times New Roman"/>
         </w:rPr>
+        <w:t>Gooseff</w:t>
+      </w:r>
+      <w:proofErr w:type="spellEnd"/>
+      <w:r>
+        <w:rPr>
+          <w:rFonts w:ascii="Times New Roman" w:hAnsi="Times New Roman"/>
+        </w:rPr>
+        <w:t xml:space="preserve">, M. N., &amp; Van Horn, D. (2014). The McMurdo Dry Valleys: A landscape on the threshold of change. </w:t>
+      </w:r>
+      <w:r>
+        <w:rPr>
+          <w:rFonts w:ascii="Times New Roman" w:hAnsi="Times New Roman"/>
+          <w:i/>
+        </w:rPr>
+        <w:t>Geomorphology</w:t>
+      </w:r>
+      <w:r>
+        <w:rPr>
+          <w:rFonts w:ascii="Times New Roman" w:hAnsi="Times New Roman"/>
+        </w:rPr>
+        <w:t xml:space="preserve"> 225:25–35.</w:t>
+      </w:r>
+    </w:p>
+    <w:p>
+      <w:r>
+        <w:rPr>
+          <w:rFonts w:ascii="Times New Roman" w:hAnsi="Times New Roman"/>
+        </w:rPr>
+        <w:t xml:space="preserve">[4] </w:t>
+      </w:r>
+      <w:proofErr w:type="spellStart"/>
+      <w:r>
+        <w:rPr>
+          <w:rFonts w:ascii="Times New Roman" w:hAnsi="Times New Roman"/>
+        </w:rPr>
         <w:t>Ronneberger</w:t>
       </w:r>
       <w:proofErr w:type="spellEnd"/>
@@ -1932,7 +1967,7 @@
         <w:rPr>
           <w:rFonts w:ascii="Times New Roman" w:hAnsi="Times New Roman"/>
         </w:rPr>
-        <w:t xml:space="preserve">[4] Barlow, M. C., Zhu, X., &amp; Glennie, C. L. (2022). Stream Boundary Detection of a Hyper-Arid, Polar Region Using a U-Net Architecture: Taylor Valley, Antarctica. </w:t>
+        <w:t xml:space="preserve">[5] Barlow, M. C., Zhu, X., &amp; Glennie, C. L. (2022). Stream Boundary Detection of a Hyper-Arid, Polar Region Using a U-Net Architecture: Taylor Valley, Antarctica. </w:t>
       </w:r>
       <w:r>
         <w:rPr>
@@ -1953,7 +1988,7 @@
         <w:rPr>
           <w:rFonts w:ascii="Times New Roman" w:hAnsi="Times New Roman"/>
         </w:rPr>
-        <w:t xml:space="preserve">[5] Howat, I. M., et al. (2019). The Reference Elevation Model of Antarctica (REMA). </w:t>
+        <w:t xml:space="preserve">[6] Howat, I. M., et al. (2019). The Reference Elevation Model of Antarctica (REMA). </w:t>
       </w:r>
       <w:r>
         <w:rPr>
@@ -1974,7 +2009,7 @@
         <w:rPr>
           <w:rFonts w:ascii="Times New Roman" w:hAnsi="Times New Roman"/>
         </w:rPr>
-        <w:t xml:space="preserve">[6] Schenk, T., </w:t>
+        <w:t xml:space="preserve">[7] Schenk, T., </w:t>
       </w:r>
       <w:proofErr w:type="spellStart"/>
       <w:r>
@@ -2010,7 +2045,7 @@
         <w:rPr>
           <w:rFonts w:ascii="Times New Roman" w:hAnsi="Times New Roman"/>
         </w:rPr>
-        <w:t xml:space="preserve">[7] </w:t>
+        <w:t xml:space="preserve">[8] </w:t>
       </w:r>
       <w:r>
         <w:rPr>
@@ -2031,7 +2066,7 @@
         <w:rPr>
           <w:rFonts w:ascii="Times New Roman" w:hAnsi="Times New Roman"/>
         </w:rPr>
-        <w:t xml:space="preserve">[8] McMurdo Dry Valleys LTER. Stream, meteorology, glacier, and soil datasets. Environmental Data Initiative (EDI), </w:t>
+        <w:t xml:space="preserve">[9] McMurdo Dry Valleys LTER. Stream, meteorology, glacier, and soil datasets. Environmental Data Initiative (EDI), </w:t>
       </w:r>
       <w:proofErr w:type="spellStart"/>
       <w:r>
@@ -2061,7 +2096,7 @@
         <w:rPr>
           <w:rFonts w:ascii="Times New Roman" w:hAnsi="Times New Roman"/>
         </w:rPr>
-        <w:t xml:space="preserve">[9] </w:t>
+        <w:t xml:space="preserve">[10] </w:t>
       </w:r>
       <w:proofErr w:type="spellStart"/>
       <w:r>
@@ -2105,41 +2140,6 @@
           <w:rFonts w:ascii="Times New Roman" w:hAnsi="Times New Roman"/>
         </w:rPr>
         <w:t xml:space="preserve"> 146:1999–2049.</w:t>
-      </w:r>
-    </w:p>
-    <w:p>
-      <w:r>
-        <w:rPr>
-          <w:rFonts w:ascii="Times New Roman" w:hAnsi="Times New Roman"/>
-        </w:rPr>
-        <w:t xml:space="preserve">[10] Fountain, A. G., Levy, J. S., </w:t>
-      </w:r>
-      <w:proofErr w:type="spellStart"/>
-      <w:r>
-        <w:rPr>
-          <w:rFonts w:ascii="Times New Roman" w:hAnsi="Times New Roman"/>
-        </w:rPr>
-        <w:t>Gooseff</w:t>
-      </w:r>
-      <w:proofErr w:type="spellEnd"/>
-      <w:r>
-        <w:rPr>
-          <w:rFonts w:ascii="Times New Roman" w:hAnsi="Times New Roman"/>
-        </w:rPr>
-        <w:t xml:space="preserve">, M. N., &amp; Van Horn, D. (2014). The McMurdo Dry Valleys: A landscape on the threshold of change. </w:t>
-      </w:r>
-      <w:r>
-        <w:rPr>
-          <w:rFonts w:ascii="Times New Roman" w:hAnsi="Times New Roman"/>
-          <w:i/>
-        </w:rPr>
-        <w:t>Geomorphology</w:t>
-      </w:r>
-      <w:r>
-        <w:rPr>
-          <w:rFonts w:ascii="Times New Roman" w:hAnsi="Times New Roman"/>
-        </w:rPr>
-        <w:t xml:space="preserve"> 225:25–35.</w:t>
       </w:r>
     </w:p>
     <w:p>

</xml_diff>